<commit_message>
Added text to lab1
</commit_message>
<xml_diff>
--- a/lab1/ОтчётИсходник.docx
+++ b/lab1/ОтчётИсходник.docx
@@ -832,7 +832,7 @@
           <w:r>
             <w:fldChar w:fldCharType="separate"/>
           </w:r>
-          <w:hyperlink w:anchor="_Toc240409874" w:history="1">
+          <w:hyperlink w:anchor="_Toc240457641" w:history="1">
             <w:r>
               <w:rPr>
                 <w:rStyle w:val="a7"/>
@@ -859,7 +859,7 @@
                 <w:noProof/>
                 <w:webHidden/>
               </w:rPr>
-              <w:instrText xml:space="preserve"> PAGEREF _Toc240409874 \h </w:instrText>
+              <w:instrText xml:space="preserve"> PAGEREF _Toc240457641 \h </w:instrText>
             </w:r>
             <w:r>
               <w:rPr>
@@ -879,7 +879,7 @@
                 <w:noProof/>
                 <w:webHidden/>
               </w:rPr>
-              <w:t>3</w:t>
+              <w:t>2</w:t>
             </w:r>
             <w:r>
               <w:rPr>
@@ -902,7 +902,7 @@
               <w:lang w:eastAsia="ru-RU"/>
             </w:rPr>
           </w:pPr>
-          <w:hyperlink w:anchor="_Toc240409875" w:history="1">
+          <w:hyperlink w:anchor="_Toc240457642" w:history="1">
             <w:r>
               <w:rPr>
                 <w:rStyle w:val="a7"/>
@@ -930,7 +930,7 @@
                 <w:noProof/>
                 <w:webHidden/>
               </w:rPr>
-              <w:instrText xml:space="preserve"> PAGEREF _Toc240409875 \h </w:instrText>
+              <w:instrText xml:space="preserve"> PAGEREF _Toc240457642 \h </w:instrText>
             </w:r>
             <w:r>
               <w:rPr>
@@ -973,7 +973,7 @@
               <w:lang w:eastAsia="ru-RU"/>
             </w:rPr>
           </w:pPr>
-          <w:hyperlink w:anchor="_Toc240409876" w:history="1">
+          <w:hyperlink w:anchor="_Toc240457643" w:history="1">
             <w:r>
               <w:rPr>
                 <w:rStyle w:val="a7"/>
@@ -1000,7 +1000,7 @@
                 <w:noProof/>
                 <w:webHidden/>
               </w:rPr>
-              <w:instrText xml:space="preserve"> PAGEREF _Toc240409876 \h </w:instrText>
+              <w:instrText xml:space="preserve"> PAGEREF _Toc240457643 \h </w:instrText>
             </w:r>
             <w:r>
               <w:rPr>
@@ -1043,7 +1043,7 @@
               <w:lang w:eastAsia="ru-RU"/>
             </w:rPr>
           </w:pPr>
-          <w:hyperlink w:anchor="_Toc240409877" w:history="1">
+          <w:hyperlink w:anchor="_Toc240457644" w:history="1">
             <w:r>
               <w:rPr>
                 <w:rStyle w:val="a7"/>
@@ -1070,7 +1070,7 @@
                 <w:noProof/>
                 <w:webHidden/>
               </w:rPr>
-              <w:instrText xml:space="preserve"> PAGEREF _Toc240409877 \h </w:instrText>
+              <w:instrText xml:space="preserve"> PAGEREF _Toc240457644 \h </w:instrText>
             </w:r>
             <w:r>
               <w:rPr>
@@ -1113,7 +1113,7 @@
               <w:lang w:eastAsia="ru-RU"/>
             </w:rPr>
           </w:pPr>
-          <w:hyperlink w:anchor="_Toc240409878" w:history="1">
+          <w:hyperlink w:anchor="_Toc240457645" w:history="1">
             <w:r>
               <w:rPr>
                 <w:rStyle w:val="a7"/>
@@ -1140,7 +1140,7 @@
                 <w:noProof/>
                 <w:webHidden/>
               </w:rPr>
-              <w:instrText xml:space="preserve"> PAGEREF _Toc240409878 \h </w:instrText>
+              <w:instrText xml:space="preserve"> PAGEREF _Toc240457645 \h </w:instrText>
             </w:r>
             <w:r>
               <w:rPr>
@@ -1184,7 +1184,7 @@
               <w:lang w:eastAsia="ru-RU"/>
             </w:rPr>
           </w:pPr>
-          <w:hyperlink w:anchor="_Toc240409879" w:history="1">
+          <w:hyperlink w:anchor="_Toc240457646" w:history="1">
             <w:r>
               <w:rPr>
                 <w:rStyle w:val="a7"/>
@@ -1226,7 +1226,7 @@
                 <w:noProof/>
                 <w:webHidden/>
               </w:rPr>
-              <w:instrText xml:space="preserve"> PAGEREF _Toc240409879 \h </w:instrText>
+              <w:instrText xml:space="preserve"> PAGEREF _Toc240457646 \h </w:instrText>
             </w:r>
             <w:r>
               <w:rPr>
@@ -1270,7 +1270,7 @@
               <w:lang w:eastAsia="ru-RU"/>
             </w:rPr>
           </w:pPr>
-          <w:hyperlink w:anchor="_Toc240409880" w:history="1">
+          <w:hyperlink w:anchor="_Toc240457647" w:history="1">
             <w:r>
               <w:rPr>
                 <w:rStyle w:val="a7"/>
@@ -1312,7 +1312,7 @@
                 <w:noProof/>
                 <w:webHidden/>
               </w:rPr>
-              <w:instrText xml:space="preserve"> PAGEREF _Toc240409880 \h </w:instrText>
+              <w:instrText xml:space="preserve"> PAGEREF _Toc240457647 \h </w:instrText>
             </w:r>
             <w:r>
               <w:rPr>
@@ -1356,7 +1356,7 @@
               <w:lang w:eastAsia="ru-RU"/>
             </w:rPr>
           </w:pPr>
-          <w:hyperlink w:anchor="_Toc240409881" w:history="1">
+          <w:hyperlink w:anchor="_Toc240457648" w:history="1">
             <w:r>
               <w:rPr>
                 <w:rStyle w:val="a7"/>
@@ -1377,7 +1377,21 @@
                 <w:rStyle w:val="a7"/>
                 <w:noProof/>
               </w:rPr>
-              <w:t>Томография</w:t>
+              <w:t>Томограф</w:t>
+            </w:r>
+            <w:r>
+              <w:rPr>
+                <w:rStyle w:val="a7"/>
+                <w:noProof/>
+              </w:rPr>
+              <w:t>и</w:t>
+            </w:r>
+            <w:r>
+              <w:rPr>
+                <w:rStyle w:val="a7"/>
+                <w:noProof/>
+              </w:rPr>
+              <w:t>я</w:t>
             </w:r>
             <w:r>
               <w:rPr>
@@ -1398,7 +1412,7 @@
                 <w:noProof/>
                 <w:webHidden/>
               </w:rPr>
-              <w:instrText xml:space="preserve"> PAGEREF _Toc240409881 \h </w:instrText>
+              <w:instrText xml:space="preserve"> PAGEREF _Toc240457648 \h </w:instrText>
             </w:r>
             <w:r>
               <w:rPr>
@@ -1419,88 +1433,6 @@
                 <w:webHidden/>
               </w:rPr>
               <w:t>4</w:t>
-            </w:r>
-            <w:r>
-              <w:rPr>
-                <w:noProof/>
-                <w:webHidden/>
-              </w:rPr>
-              <w:fldChar w:fldCharType="end"/>
-            </w:r>
-          </w:hyperlink>
-        </w:p>
-        <w:p>
-          <w:pPr>
-            <w:pStyle w:val="21"/>
-            <w:tabs>
-              <w:tab w:val="left" w:pos="660"/>
-              <w:tab w:val="right" w:leader="dot" w:pos="9345"/>
-            </w:tabs>
-            <w:rPr>
-              <w:rFonts w:asciiTheme="minorHAnsi" w:eastAsiaTheme="minorEastAsia" w:hAnsiTheme="minorHAnsi" w:cstheme="minorBidi"/>
-              <w:noProof/>
-              <w:lang w:eastAsia="ru-RU"/>
-            </w:rPr>
-          </w:pPr>
-          <w:hyperlink w:anchor="_Toc240409882" w:history="1">
-            <w:r>
-              <w:rPr>
-                <w:rStyle w:val="a7"/>
-                <w:noProof/>
-              </w:rPr>
-              <w:t>2.</w:t>
-            </w:r>
-            <w:r>
-              <w:rPr>
-                <w:rFonts w:asciiTheme="minorHAnsi" w:eastAsiaTheme="minorEastAsia" w:hAnsiTheme="minorHAnsi" w:cstheme="minorBidi"/>
-                <w:noProof/>
-                <w:lang w:eastAsia="ru-RU"/>
-              </w:rPr>
-              <w:tab/>
-            </w:r>
-            <w:r>
-              <w:rPr>
-                <w:rStyle w:val="a7"/>
-                <w:noProof/>
-              </w:rPr>
-              <w:t>Обсуждение результатов</w:t>
-            </w:r>
-            <w:r>
-              <w:rPr>
-                <w:noProof/>
-                <w:webHidden/>
-              </w:rPr>
-              <w:tab/>
-            </w:r>
-            <w:r>
-              <w:rPr>
-                <w:noProof/>
-                <w:webHidden/>
-              </w:rPr>
-              <w:fldChar w:fldCharType="begin"/>
-            </w:r>
-            <w:r>
-              <w:rPr>
-                <w:noProof/>
-                <w:webHidden/>
-              </w:rPr>
-              <w:instrText xml:space="preserve"> PAGEREF _Toc240409882 \h </w:instrText>
-            </w:r>
-            <w:r>
-              <w:rPr>
-                <w:noProof/>
-                <w:webHidden/>
-              </w:rPr>
-              <w:fldChar w:fldCharType="separate"/>
-            </w:r>
-            <w:r>
-              <w:rPr>
-                <w:b/>
-                <w:bCs/>
-                <w:noProof/>
-                <w:webHidden/>
-              </w:rPr>
-              <w:t>Ошибка! Закладка не определена.</w:t>
             </w:r>
             <w:r>
               <w:rPr>
@@ -1523,7 +1455,7 @@
               <w:lang w:eastAsia="ru-RU"/>
             </w:rPr>
           </w:pPr>
-          <w:hyperlink w:anchor="_Toc240409883" w:history="1">
+          <w:hyperlink w:anchor="_Toc240457649" w:history="1">
             <w:r>
               <w:rPr>
                 <w:rStyle w:val="a7"/>
@@ -1550,7 +1482,7 @@
                 <w:noProof/>
                 <w:webHidden/>
               </w:rPr>
-              <w:instrText xml:space="preserve"> PAGEREF _Toc240409883 \h </w:instrText>
+              <w:instrText xml:space="preserve"> PAGEREF _Toc240457649 \h </w:instrText>
             </w:r>
             <w:r>
               <w:rPr>
@@ -1593,7 +1525,7 @@
               <w:lang w:eastAsia="ru-RU"/>
             </w:rPr>
           </w:pPr>
-          <w:hyperlink w:anchor="_Toc240409884" w:history="1">
+          <w:hyperlink w:anchor="_Toc240457650" w:history="1">
             <w:r>
               <w:rPr>
                 <w:rStyle w:val="a7"/>
@@ -1620,7 +1552,7 @@
                 <w:noProof/>
                 <w:webHidden/>
               </w:rPr>
-              <w:instrText xml:space="preserve"> PAGEREF _Toc240409884 \h </w:instrText>
+              <w:instrText xml:space="preserve"> PAGEREF _Toc240457650 \h </w:instrText>
             </w:r>
             <w:r>
               <w:rPr>
@@ -1663,7 +1595,7 @@
               <w:lang w:eastAsia="ru-RU"/>
             </w:rPr>
           </w:pPr>
-          <w:hyperlink w:anchor="_Toc240409885" w:history="1">
+          <w:hyperlink w:anchor="_Toc240457651" w:history="1">
             <w:r>
               <w:rPr>
                 <w:rStyle w:val="a7"/>
@@ -1690,7 +1622,7 @@
                 <w:noProof/>
                 <w:webHidden/>
               </w:rPr>
-              <w:instrText xml:space="preserve"> PAGEREF _Toc240409885 \h </w:instrText>
+              <w:instrText xml:space="preserve"> PAGEREF _Toc240457651 \h </w:instrText>
             </w:r>
             <w:r>
               <w:rPr>
@@ -1733,7 +1665,7 @@
               <w:lang w:eastAsia="ru-RU"/>
             </w:rPr>
           </w:pPr>
-          <w:hyperlink w:anchor="_Toc240409886" w:history="1">
+          <w:hyperlink w:anchor="_Toc240457652" w:history="1">
             <w:r>
               <w:rPr>
                 <w:rStyle w:val="a7"/>
@@ -1760,7 +1692,7 @@
                 <w:noProof/>
                 <w:webHidden/>
               </w:rPr>
-              <w:instrText xml:space="preserve"> PAGEREF _Toc240409886 \h </w:instrText>
+              <w:instrText xml:space="preserve"> PAGEREF _Toc240457652 \h </w:instrText>
             </w:r>
             <w:r>
               <w:rPr>
@@ -1780,7 +1712,7 @@
                 <w:noProof/>
                 <w:webHidden/>
               </w:rPr>
-              <w:t>6</w:t>
+              <w:t>5</w:t>
             </w:r>
             <w:r>
               <w:rPr>
@@ -1803,7 +1735,7 @@
               <w:lang w:eastAsia="ru-RU"/>
             </w:rPr>
           </w:pPr>
-          <w:hyperlink w:anchor="_Toc240409887" w:history="1">
+          <w:hyperlink w:anchor="_Toc240457653" w:history="1">
             <w:r>
               <w:rPr>
                 <w:rStyle w:val="a7"/>
@@ -1830,7 +1762,7 @@
                 <w:noProof/>
                 <w:webHidden/>
               </w:rPr>
-              <w:instrText xml:space="preserve"> PAGEREF _Toc240409887 \h </w:instrText>
+              <w:instrText xml:space="preserve"> PAGEREF _Toc240457653 \h </w:instrText>
             </w:r>
             <w:r>
               <w:rPr>
@@ -1850,7 +1782,7 @@
                 <w:noProof/>
                 <w:webHidden/>
               </w:rPr>
-              <w:t>6</w:t>
+              <w:t>5</w:t>
             </w:r>
             <w:r>
               <w:rPr>
@@ -2081,9 +2013,8 @@
       <w:pPr>
         <w:pStyle w:val="1"/>
       </w:pPr>
-      <w:bookmarkStart w:id="0" w:name="_Toc240409874"/>
-      <w:r>
-        <w:lastRenderedPageBreak/>
+      <w:bookmarkStart w:id="0" w:name="_Toc240457641"/>
+      <w:r>
         <w:t>Формулировка задачи</w:t>
       </w:r>
       <w:bookmarkEnd w:id="0"/>
@@ -2145,6 +2076,7 @@
               <w:rFonts w:ascii="Cambria Math" w:eastAsia="Times New Roman" w:hAnsi="Cambria Math" w:cstheme="majorHAnsi"/>
               <w:lang w:eastAsia="ru-RU"/>
             </w:rPr>
+            <w:lastRenderedPageBreak/>
             <m:t>A</m:t>
           </m:r>
           <m:r>
@@ -2183,7 +2115,7 @@
           <w:szCs w:val="22"/>
         </w:rPr>
       </w:pPr>
-      <w:bookmarkStart w:id="1" w:name="_Toc240409875"/>
+      <w:bookmarkStart w:id="1" w:name="_Toc240457642"/>
       <w:r>
         <w:rPr>
           <w:rFonts w:cstheme="majorHAnsi"/>
@@ -3668,7 +3600,7 @@
       <w:pPr>
         <w:pStyle w:val="2"/>
       </w:pPr>
-      <w:bookmarkStart w:id="2" w:name="_Toc240409876"/>
+      <w:bookmarkStart w:id="2" w:name="_Toc240457643"/>
       <w:r>
         <w:t>2. Квадратная матрица</w:t>
       </w:r>
@@ -4556,7 +4488,6 @@
           <w:rFonts w:asciiTheme="majorHAnsi" w:eastAsia="Times New Roman" w:hAnsiTheme="majorHAnsi" w:cstheme="majorHAnsi"/>
           <w:lang w:eastAsia="ru-RU"/>
         </w:rPr>
-        <w:lastRenderedPageBreak/>
         <w:t xml:space="preserve">Для найденного минимального значения </w:t>
       </w:r>
       <m:oMath>
@@ -4803,6 +4734,7 @@
           <w:rFonts w:asciiTheme="majorHAnsi" w:eastAsia="Times New Roman" w:hAnsiTheme="majorHAnsi" w:cstheme="majorHAnsi"/>
           <w:lang w:eastAsia="ru-RU"/>
         </w:rPr>
+        <w:lastRenderedPageBreak/>
         <w:t xml:space="preserve">Проверить принадлежность найденной матрицы </w:t>
       </w:r>
       <m:oMath>
@@ -4901,7 +4833,7 @@
       <w:pPr>
         <w:pStyle w:val="2"/>
       </w:pPr>
-      <w:bookmarkStart w:id="3" w:name="_Toc240409877"/>
+      <w:bookmarkStart w:id="3" w:name="_Toc240457644"/>
       <w:r>
         <w:t>3. Обсуждение результатов</w:t>
       </w:r>
@@ -4930,7 +4862,7 @@
       <w:pPr>
         <w:pStyle w:val="1"/>
       </w:pPr>
-      <w:bookmarkStart w:id="4" w:name="_Toc240409878"/>
+      <w:bookmarkStart w:id="4" w:name="_Toc240457645"/>
       <w:r>
         <w:t>Решение</w:t>
       </w:r>
@@ -4944,7 +4876,7 @@
           <w:numId w:val="14"/>
         </w:numPr>
       </w:pPr>
-      <w:bookmarkStart w:id="5" w:name="_Toc240409879"/>
+      <w:bookmarkStart w:id="5" w:name="_Toc240457646"/>
       <w:r>
         <w:t>Прямоугольная матрица</w:t>
       </w:r>
@@ -4958,7 +4890,7 @@
           <w:numId w:val="14"/>
         </w:numPr>
       </w:pPr>
-      <w:bookmarkStart w:id="6" w:name="_Toc240409880"/>
+      <w:bookmarkStart w:id="6" w:name="_Toc240457647"/>
       <w:r>
         <w:t>Регрессия</w:t>
       </w:r>
@@ -6405,7 +6337,7 @@
           <w:numId w:val="14"/>
         </w:numPr>
       </w:pPr>
-      <w:bookmarkStart w:id="7" w:name="_Toc240409881"/>
+      <w:bookmarkStart w:id="7" w:name="_Toc240457648"/>
       <w:r>
         <w:t>Томография</w:t>
       </w:r>
@@ -7734,6 +7666,7 @@
     </w:p>
     <w:p>
       <w:r>
+        <w:lastRenderedPageBreak/>
         <w:t>Это значение меньше, чем в регрессионном случае (</w:t>
       </w:r>
       <m:oMath>
@@ -8356,7 +8289,7 @@
       <w:pPr>
         <w:pStyle w:val="1"/>
       </w:pPr>
-      <w:bookmarkStart w:id="8" w:name="_Toc240409883"/>
+      <w:bookmarkStart w:id="8" w:name="_Toc240457649"/>
       <w:r>
         <w:t>Реализация</w:t>
       </w:r>
@@ -8708,7 +8641,7 @@
       <w:pPr>
         <w:pStyle w:val="1"/>
       </w:pPr>
-      <w:bookmarkStart w:id="9" w:name="_Toc240409884"/>
+      <w:bookmarkStart w:id="9" w:name="_Toc240457650"/>
       <w:r>
         <w:t>Результаты</w:t>
       </w:r>
@@ -9187,6 +9120,7 @@
       <w:pPr>
         <w:rPr>
           <w:rFonts w:asciiTheme="majorHAnsi" w:hAnsiTheme="majorHAnsi" w:cstheme="majorHAnsi"/>
+          <w:lang w:val="en-US"/>
         </w:rPr>
       </w:pPr>
       <w:r>
@@ -9338,14 +9272,51 @@
         <w:rPr>
           <w:rFonts w:asciiTheme="majorHAnsi" w:hAnsiTheme="majorHAnsi" w:cstheme="majorHAnsi"/>
         </w:rPr>
-        <w:t xml:space="preserve"> в ней у задачи появилось больше свободы (можно сделать </w:t>
+        <w:t xml:space="preserve"> в ней у задачи появилось больше свободы (можно </w:t>
+      </w:r>
+      <w:r>
+        <w:rPr>
+          <w:rFonts w:asciiTheme="majorHAnsi" w:hAnsiTheme="majorHAnsi" w:cstheme="majorHAnsi"/>
+        </w:rPr>
+        <w:t xml:space="preserve">сделать матрицу </w:t>
+      </w:r>
+      <w:r>
+        <w:rPr>
+          <w:rFonts w:asciiTheme="majorHAnsi" w:hAnsiTheme="majorHAnsi" w:cstheme="majorHAnsi"/>
+          <w:lang w:val="en-US"/>
+        </w:rPr>
+        <w:t>rank</w:t>
+      </w:r>
+      <w:r>
+        <w:rPr>
+          <w:rFonts w:asciiTheme="majorHAnsi" w:hAnsiTheme="majorHAnsi" w:cstheme="majorHAnsi"/>
+        </w:rPr>
+        <w:t xml:space="preserve"> 1 </w:t>
+      </w:r>
+      <w:r>
+        <w:rPr>
+          <w:rFonts w:asciiTheme="majorHAnsi" w:hAnsiTheme="majorHAnsi" w:cstheme="majorHAnsi"/>
+        </w:rPr>
+        <w:t>по столбцам</w:t>
+      </w:r>
+      <w:r>
+        <w:rPr>
+          <w:rFonts w:asciiTheme="majorHAnsi" w:hAnsiTheme="majorHAnsi" w:cstheme="majorHAnsi"/>
+        </w:rPr>
+        <w:t xml:space="preserve">, </w:t>
+      </w:r>
+      <w:r>
+        <w:rPr>
+          <w:rFonts w:asciiTheme="majorHAnsi" w:hAnsiTheme="majorHAnsi" w:cstheme="majorHAnsi"/>
+        </w:rPr>
+        <w:t>а не только по строчкам)</w:t>
       </w:r>
     </w:p>
     <w:p>
       <w:pPr>
         <w:pStyle w:val="1"/>
       </w:pPr>
-      <w:bookmarkStart w:id="10" w:name="_Toc240409885"/>
+      <w:bookmarkStart w:id="10" w:name="_Toc240457651"/>
       <w:r>
         <w:t>Вывод</w:t>
       </w:r>
@@ -9714,9 +9685,8 @@
       <w:pPr>
         <w:pStyle w:val="1"/>
       </w:pPr>
-      <w:bookmarkStart w:id="11" w:name="_Toc240409886"/>
-      <w:r>
-        <w:lastRenderedPageBreak/>
+      <w:bookmarkStart w:id="11" w:name="_Toc240457652"/>
+      <w:r>
         <w:t>Список литературы</w:t>
       </w:r>
       <w:bookmarkEnd w:id="11"/>
@@ -9730,7 +9700,7 @@
       <w:pPr>
         <w:pStyle w:val="1"/>
       </w:pPr>
-      <w:bookmarkStart w:id="12" w:name="_Toc240409887"/>
+      <w:bookmarkStart w:id="12" w:name="_Toc240457653"/>
       <w:r>
         <w:t>Приложения</w:t>
       </w:r>

</xml_diff>